<commit_message>
docs: add group members to submission materials
</commit_message>
<xml_diff>
--- a/deliverables/个人财务管理与可视化看板-综合实训设计报告.docx
+++ b/deliverables/个人财务管理与可视化看板-综合实训设计报告.docx
@@ -72,7 +72,7 @@
     </w:p>
     <w:tbl>
       <w:tblPr>
-        <w:tblW w:type="pct" w:w="100%"/>
+        <w:tblW w:type="dxa" w:w="8400"/>
         <w:tblBorders>
           <w:top w:val="single" w:color="DCE5E8" w:sz="4"/>
           <w:left w:val="single" w:color="DCE5E8" w:sz="4"/>
@@ -92,6 +92,7 @@
         </w:trPr>
         <w:tc>
           <w:tcPr>
+            <w:tcW w:type="dxa" w:w="2800"/>
             <w:shd w:fill="17324D" w:color="auto" w:val="clear"/>
             <w:tcMar>
               <w:top w:type="dxa" w:w="100"/>
@@ -117,6 +118,7 @@
         </w:tc>
         <w:tc>
           <w:tcPr>
+            <w:tcW w:type="dxa" w:w="5600"/>
             <w:shd w:fill="17324D" w:color="auto" w:val="clear"/>
             <w:tcMar>
               <w:top w:type="dxa" w:w="100"/>
@@ -136,7 +138,7 @@
                 <w:sz w:val="19"/>
                 <w:szCs w:val="19"/>
               </w:rPr>
-              <w:t xml:space="preserve">请填写</w:t>
+              <w:t xml:space="preserve">信息</w:t>
             </w:r>
           </w:p>
         </w:tc>
@@ -144,6 +146,7 @@
       <w:tr>
         <w:tc>
           <w:tcPr>
+            <w:tcW w:type="dxa" w:w="2800"/>
             <w:shd w:fill="FCFDFC" w:color="auto" w:val="clear"/>
             <w:tcMar>
               <w:top w:type="dxa" w:w="100"/>
@@ -169,6 +172,7 @@
         </w:tc>
         <w:tc>
           <w:tcPr>
+            <w:tcW w:type="dxa" w:w="5600"/>
             <w:shd w:fill="FCFDFC" w:color="auto" w:val="clear"/>
             <w:tcMar>
               <w:top w:type="dxa" w:w="100"/>
@@ -196,51 +200,53 @@
       <w:tr>
         <w:tc>
           <w:tcPr>
-            <w:shd w:fill="FCFDFC" w:color="auto" w:val="clear"/>
-            <w:tcMar>
-              <w:top w:type="dxa" w:w="100"/>
-              <w:left w:type="dxa" w:w="120"/>
-              <w:bottom w:type="dxa" w:w="100"/>
-              <w:right w:type="dxa" w:w="120"/>
-            </w:tcMar>
-            <w:vAlign w:val="center"/>
-          </w:tcPr>
-          <w:p>
-            <w:r>
-              <w:rPr>
-                <w:rFonts w:ascii="Microsoft YaHei" w:cs="Microsoft YaHei" w:eastAsia="Microsoft YaHei" w:hAnsi="Microsoft YaHei"/>
-                <w:b w:val="false"/>
-                <w:bCs w:val="false"/>
-                <w:color w:val="17324D"/>
-                <w:sz w:val="19"/>
-                <w:szCs w:val="19"/>
-              </w:rPr>
-              <w:t xml:space="preserve">姓名</w:t>
-            </w:r>
-          </w:p>
-        </w:tc>
-        <w:tc>
-          <w:tcPr>
-            <w:shd w:fill="FCFDFC" w:color="auto" w:val="clear"/>
-            <w:tcMar>
-              <w:top w:type="dxa" w:w="100"/>
-              <w:left w:type="dxa" w:w="120"/>
-              <w:bottom w:type="dxa" w:w="100"/>
-              <w:right w:type="dxa" w:w="120"/>
-            </w:tcMar>
-            <w:vAlign w:val="center"/>
-          </w:tcPr>
-          <w:p>
-            <w:r>
-              <w:rPr>
-                <w:rFonts w:ascii="Microsoft YaHei" w:cs="Microsoft YaHei" w:eastAsia="Microsoft YaHei" w:hAnsi="Microsoft YaHei"/>
-                <w:b w:val="false"/>
-                <w:bCs w:val="false"/>
-                <w:color w:val="17324D"/>
-                <w:sz w:val="19"/>
-                <w:szCs w:val="19"/>
-              </w:rPr>
-              <w:t xml:space="preserve">【请填写姓名】</w:t>
+            <w:tcW w:type="dxa" w:w="2800"/>
+            <w:shd w:fill="FCFDFC" w:color="auto" w:val="clear"/>
+            <w:tcMar>
+              <w:top w:type="dxa" w:w="100"/>
+              <w:left w:type="dxa" w:w="120"/>
+              <w:bottom w:type="dxa" w:w="100"/>
+              <w:right w:type="dxa" w:w="120"/>
+            </w:tcMar>
+            <w:vAlign w:val="center"/>
+          </w:tcPr>
+          <w:p>
+            <w:r>
+              <w:rPr>
+                <w:rFonts w:ascii="Microsoft YaHei" w:cs="Microsoft YaHei" w:eastAsia="Microsoft YaHei" w:hAnsi="Microsoft YaHei"/>
+                <w:b w:val="false"/>
+                <w:bCs w:val="false"/>
+                <w:color w:val="17324D"/>
+                <w:sz w:val="19"/>
+                <w:szCs w:val="19"/>
+              </w:rPr>
+              <w:t xml:space="preserve">小组成员</w:t>
+            </w:r>
+          </w:p>
+        </w:tc>
+        <w:tc>
+          <w:tcPr>
+            <w:tcW w:type="dxa" w:w="5600"/>
+            <w:shd w:fill="FCFDFC" w:color="auto" w:val="clear"/>
+            <w:tcMar>
+              <w:top w:type="dxa" w:w="100"/>
+              <w:left w:type="dxa" w:w="120"/>
+              <w:bottom w:type="dxa" w:w="100"/>
+              <w:right w:type="dxa" w:w="120"/>
+            </w:tcMar>
+            <w:vAlign w:val="center"/>
+          </w:tcPr>
+          <w:p>
+            <w:r>
+              <w:rPr>
+                <w:rFonts w:ascii="Microsoft YaHei" w:cs="Microsoft YaHei" w:eastAsia="Microsoft YaHei" w:hAnsi="Microsoft YaHei"/>
+                <w:b w:val="false"/>
+                <w:bCs w:val="false"/>
+                <w:color w:val="17324D"/>
+                <w:sz w:val="19"/>
+                <w:szCs w:val="19"/>
+              </w:rPr>
+              <w:t xml:space="preserve">蓝思钰 52302042011；姜萱萱 52302042008；刘晓盼 52302042019；王晨 52302042035；朱婷婷 52302042055</w:t>
             </w:r>
           </w:p>
         </w:tc>
@@ -248,51 +254,53 @@
       <w:tr>
         <w:tc>
           <w:tcPr>
-            <w:shd w:fill="FCFDFC" w:color="auto" w:val="clear"/>
-            <w:tcMar>
-              <w:top w:type="dxa" w:w="100"/>
-              <w:left w:type="dxa" w:w="120"/>
-              <w:bottom w:type="dxa" w:w="100"/>
-              <w:right w:type="dxa" w:w="120"/>
-            </w:tcMar>
-            <w:vAlign w:val="center"/>
-          </w:tcPr>
-          <w:p>
-            <w:r>
-              <w:rPr>
-                <w:rFonts w:ascii="Microsoft YaHei" w:cs="Microsoft YaHei" w:eastAsia="Microsoft YaHei" w:hAnsi="Microsoft YaHei"/>
-                <w:b w:val="false"/>
-                <w:bCs w:val="false"/>
-                <w:color w:val="17324D"/>
-                <w:sz w:val="19"/>
-                <w:szCs w:val="19"/>
-              </w:rPr>
-              <w:t xml:space="preserve">学号</w:t>
-            </w:r>
-          </w:p>
-        </w:tc>
-        <w:tc>
-          <w:tcPr>
-            <w:shd w:fill="FCFDFC" w:color="auto" w:val="clear"/>
-            <w:tcMar>
-              <w:top w:type="dxa" w:w="100"/>
-              <w:left w:type="dxa" w:w="120"/>
-              <w:bottom w:type="dxa" w:w="100"/>
-              <w:right w:type="dxa" w:w="120"/>
-            </w:tcMar>
-            <w:vAlign w:val="center"/>
-          </w:tcPr>
-          <w:p>
-            <w:r>
-              <w:rPr>
-                <w:rFonts w:ascii="Microsoft YaHei" w:cs="Microsoft YaHei" w:eastAsia="Microsoft YaHei" w:hAnsi="Microsoft YaHei"/>
-                <w:b w:val="false"/>
-                <w:bCs w:val="false"/>
-                <w:color w:val="17324D"/>
-                <w:sz w:val="19"/>
-                <w:szCs w:val="19"/>
-              </w:rPr>
-              <w:t xml:space="preserve">【请填写学号】</w:t>
+            <w:tcW w:type="dxa" w:w="2800"/>
+            <w:shd w:fill="FCFDFC" w:color="auto" w:val="clear"/>
+            <w:tcMar>
+              <w:top w:type="dxa" w:w="100"/>
+              <w:left w:type="dxa" w:w="120"/>
+              <w:bottom w:type="dxa" w:w="100"/>
+              <w:right w:type="dxa" w:w="120"/>
+            </w:tcMar>
+            <w:vAlign w:val="center"/>
+          </w:tcPr>
+          <w:p>
+            <w:r>
+              <w:rPr>
+                <w:rFonts w:ascii="Microsoft YaHei" w:cs="Microsoft YaHei" w:eastAsia="Microsoft YaHei" w:hAnsi="Microsoft YaHei"/>
+                <w:b w:val="false"/>
+                <w:bCs w:val="false"/>
+                <w:color w:val="17324D"/>
+                <w:sz w:val="19"/>
+                <w:szCs w:val="19"/>
+              </w:rPr>
+              <w:t xml:space="preserve">班级</w:t>
+            </w:r>
+          </w:p>
+        </w:tc>
+        <w:tc>
+          <w:tcPr>
+            <w:tcW w:type="dxa" w:w="5600"/>
+            <w:shd w:fill="FCFDFC" w:color="auto" w:val="clear"/>
+            <w:tcMar>
+              <w:top w:type="dxa" w:w="100"/>
+              <w:left w:type="dxa" w:w="120"/>
+              <w:bottom w:type="dxa" w:w="100"/>
+              <w:right w:type="dxa" w:w="120"/>
+            </w:tcMar>
+            <w:vAlign w:val="center"/>
+          </w:tcPr>
+          <w:p>
+            <w:r>
+              <w:rPr>
+                <w:rFonts w:ascii="Microsoft YaHei" w:cs="Microsoft YaHei" w:eastAsia="Microsoft YaHei" w:hAnsi="Microsoft YaHei"/>
+                <w:b w:val="false"/>
+                <w:bCs w:val="false"/>
+                <w:color w:val="17324D"/>
+                <w:sz w:val="19"/>
+                <w:szCs w:val="19"/>
+              </w:rPr>
+              <w:t xml:space="preserve">【请填写班级】</w:t>
             </w:r>
           </w:p>
         </w:tc>
@@ -300,51 +308,53 @@
       <w:tr>
         <w:tc>
           <w:tcPr>
-            <w:shd w:fill="FCFDFC" w:color="auto" w:val="clear"/>
-            <w:tcMar>
-              <w:top w:type="dxa" w:w="100"/>
-              <w:left w:type="dxa" w:w="120"/>
-              <w:bottom w:type="dxa" w:w="100"/>
-              <w:right w:type="dxa" w:w="120"/>
-            </w:tcMar>
-            <w:vAlign w:val="center"/>
-          </w:tcPr>
-          <w:p>
-            <w:r>
-              <w:rPr>
-                <w:rFonts w:ascii="Microsoft YaHei" w:cs="Microsoft YaHei" w:eastAsia="Microsoft YaHei" w:hAnsi="Microsoft YaHei"/>
-                <w:b w:val="false"/>
-                <w:bCs w:val="false"/>
-                <w:color w:val="17324D"/>
-                <w:sz w:val="19"/>
-                <w:szCs w:val="19"/>
-              </w:rPr>
-              <w:t xml:space="preserve">班级</w:t>
-            </w:r>
-          </w:p>
-        </w:tc>
-        <w:tc>
-          <w:tcPr>
-            <w:shd w:fill="FCFDFC" w:color="auto" w:val="clear"/>
-            <w:tcMar>
-              <w:top w:type="dxa" w:w="100"/>
-              <w:left w:type="dxa" w:w="120"/>
-              <w:bottom w:type="dxa" w:w="100"/>
-              <w:right w:type="dxa" w:w="120"/>
-            </w:tcMar>
-            <w:vAlign w:val="center"/>
-          </w:tcPr>
-          <w:p>
-            <w:r>
-              <w:rPr>
-                <w:rFonts w:ascii="Microsoft YaHei" w:cs="Microsoft YaHei" w:eastAsia="Microsoft YaHei" w:hAnsi="Microsoft YaHei"/>
-                <w:b w:val="false"/>
-                <w:bCs w:val="false"/>
-                <w:color w:val="17324D"/>
-                <w:sz w:val="19"/>
-                <w:szCs w:val="19"/>
-              </w:rPr>
-              <w:t xml:space="preserve">【请填写班级】</w:t>
+            <w:tcW w:type="dxa" w:w="2800"/>
+            <w:shd w:fill="FCFDFC" w:color="auto" w:val="clear"/>
+            <w:tcMar>
+              <w:top w:type="dxa" w:w="100"/>
+              <w:left w:type="dxa" w:w="120"/>
+              <w:bottom w:type="dxa" w:w="100"/>
+              <w:right w:type="dxa" w:w="120"/>
+            </w:tcMar>
+            <w:vAlign w:val="center"/>
+          </w:tcPr>
+          <w:p>
+            <w:r>
+              <w:rPr>
+                <w:rFonts w:ascii="Microsoft YaHei" w:cs="Microsoft YaHei" w:eastAsia="Microsoft YaHei" w:hAnsi="Microsoft YaHei"/>
+                <w:b w:val="false"/>
+                <w:bCs w:val="false"/>
+                <w:color w:val="17324D"/>
+                <w:sz w:val="19"/>
+                <w:szCs w:val="19"/>
+              </w:rPr>
+              <w:t xml:space="preserve">指导教师</w:t>
+            </w:r>
+          </w:p>
+        </w:tc>
+        <w:tc>
+          <w:tcPr>
+            <w:tcW w:type="dxa" w:w="5600"/>
+            <w:shd w:fill="FCFDFC" w:color="auto" w:val="clear"/>
+            <w:tcMar>
+              <w:top w:type="dxa" w:w="100"/>
+              <w:left w:type="dxa" w:w="120"/>
+              <w:bottom w:type="dxa" w:w="100"/>
+              <w:right w:type="dxa" w:w="120"/>
+            </w:tcMar>
+            <w:vAlign w:val="center"/>
+          </w:tcPr>
+          <w:p>
+            <w:r>
+              <w:rPr>
+                <w:rFonts w:ascii="Microsoft YaHei" w:cs="Microsoft YaHei" w:eastAsia="Microsoft YaHei" w:hAnsi="Microsoft YaHei"/>
+                <w:b w:val="false"/>
+                <w:bCs w:val="false"/>
+                <w:color w:val="17324D"/>
+                <w:sz w:val="19"/>
+                <w:szCs w:val="19"/>
+              </w:rPr>
+              <w:t xml:space="preserve">【请填写指导教师】</w:t>
             </w:r>
           </w:p>
         </w:tc>
@@ -352,58 +362,7 @@
       <w:tr>
         <w:tc>
           <w:tcPr>
-            <w:shd w:fill="FCFDFC" w:color="auto" w:val="clear"/>
-            <w:tcMar>
-              <w:top w:type="dxa" w:w="100"/>
-              <w:left w:type="dxa" w:w="120"/>
-              <w:bottom w:type="dxa" w:w="100"/>
-              <w:right w:type="dxa" w:w="120"/>
-            </w:tcMar>
-            <w:vAlign w:val="center"/>
-          </w:tcPr>
-          <w:p>
-            <w:r>
-              <w:rPr>
-                <w:rFonts w:ascii="Microsoft YaHei" w:cs="Microsoft YaHei" w:eastAsia="Microsoft YaHei" w:hAnsi="Microsoft YaHei"/>
-                <w:b w:val="false"/>
-                <w:bCs w:val="false"/>
-                <w:color w:val="17324D"/>
-                <w:sz w:val="19"/>
-                <w:szCs w:val="19"/>
-              </w:rPr>
-              <w:t xml:space="preserve">指导教师</w:t>
-            </w:r>
-          </w:p>
-        </w:tc>
-        <w:tc>
-          <w:tcPr>
-            <w:shd w:fill="FCFDFC" w:color="auto" w:val="clear"/>
-            <w:tcMar>
-              <w:top w:type="dxa" w:w="100"/>
-              <w:left w:type="dxa" w:w="120"/>
-              <w:bottom w:type="dxa" w:w="100"/>
-              <w:right w:type="dxa" w:w="120"/>
-            </w:tcMar>
-            <w:vAlign w:val="center"/>
-          </w:tcPr>
-          <w:p>
-            <w:r>
-              <w:rPr>
-                <w:rFonts w:ascii="Microsoft YaHei" w:cs="Microsoft YaHei" w:eastAsia="Microsoft YaHei" w:hAnsi="Microsoft YaHei"/>
-                <w:b w:val="false"/>
-                <w:bCs w:val="false"/>
-                <w:color w:val="17324D"/>
-                <w:sz w:val="19"/>
-                <w:szCs w:val="19"/>
-              </w:rPr>
-              <w:t xml:space="preserve">【请填写指导教师】</w:t>
-            </w:r>
-          </w:p>
-        </w:tc>
-      </w:tr>
-      <w:tr>
-        <w:tc>
-          <w:tcPr>
+            <w:tcW w:type="dxa" w:w="2800"/>
             <w:shd w:fill="FCFDFC" w:color="auto" w:val="clear"/>
             <w:tcMar>
               <w:top w:type="dxa" w:w="100"/>
@@ -429,6 +388,7 @@
         </w:tc>
         <w:tc>
           <w:tcPr>
+            <w:tcW w:type="dxa" w:w="5600"/>
             <w:shd w:fill="FCFDFC" w:color="auto" w:val="clear"/>
             <w:tcMar>
               <w:top w:type="dxa" w:w="100"/>
@@ -729,7 +689,7 @@
     </w:p>
     <w:tbl>
       <w:tblPr>
-        <w:tblW w:type="pct" w:w="100%"/>
+        <w:tblW w:type="dxa" w:w="8400"/>
         <w:tblBorders>
           <w:top w:val="single" w:color="DCE5E8" w:sz="4"/>
           <w:left w:val="single" w:color="DCE5E8" w:sz="4"/>
@@ -750,6 +710,7 @@
         </w:trPr>
         <w:tc>
           <w:tcPr>
+            <w:tcW w:type="dxa" w:w="1900"/>
             <w:shd w:fill="17324D" w:color="auto" w:val="clear"/>
             <w:tcMar>
               <w:top w:type="dxa" w:w="100"/>
@@ -775,6 +736,7 @@
         </w:tc>
         <w:tc>
           <w:tcPr>
+            <w:tcW w:type="dxa" w:w="5200"/>
             <w:shd w:fill="17324D" w:color="auto" w:val="clear"/>
             <w:tcMar>
               <w:top w:type="dxa" w:w="100"/>
@@ -800,6 +762,7 @@
         </w:tc>
         <w:tc>
           <w:tcPr>
+            <w:tcW w:type="dxa" w:w="1300"/>
             <w:shd w:fill="17324D" w:color="auto" w:val="clear"/>
             <w:tcMar>
               <w:top w:type="dxa" w:w="100"/>
@@ -827,6 +790,7 @@
       <w:tr>
         <w:tc>
           <w:tcPr>
+            <w:tcW w:type="dxa" w:w="1900"/>
             <w:shd w:fill="FCFDFC" w:color="auto" w:val="clear"/>
             <w:tcMar>
               <w:top w:type="dxa" w:w="100"/>
@@ -852,6 +816,7 @@
         </w:tc>
         <w:tc>
           <w:tcPr>
+            <w:tcW w:type="dxa" w:w="5200"/>
             <w:shd w:fill="FCFDFC" w:color="auto" w:val="clear"/>
             <w:tcMar>
               <w:top w:type="dxa" w:w="100"/>
@@ -877,6 +842,7 @@
         </w:tc>
         <w:tc>
           <w:tcPr>
+            <w:tcW w:type="dxa" w:w="1300"/>
             <w:shd w:fill="FCFDFC" w:color="auto" w:val="clear"/>
             <w:tcMar>
               <w:top w:type="dxa" w:w="100"/>
@@ -904,6 +870,7 @@
       <w:tr>
         <w:tc>
           <w:tcPr>
+            <w:tcW w:type="dxa" w:w="1900"/>
             <w:shd w:fill="FCFDFC" w:color="auto" w:val="clear"/>
             <w:tcMar>
               <w:top w:type="dxa" w:w="100"/>
@@ -929,6 +896,7 @@
         </w:tc>
         <w:tc>
           <w:tcPr>
+            <w:tcW w:type="dxa" w:w="5200"/>
             <w:shd w:fill="FCFDFC" w:color="auto" w:val="clear"/>
             <w:tcMar>
               <w:top w:type="dxa" w:w="100"/>
@@ -954,6 +922,7 @@
         </w:tc>
         <w:tc>
           <w:tcPr>
+            <w:tcW w:type="dxa" w:w="1300"/>
             <w:shd w:fill="FCFDFC" w:color="auto" w:val="clear"/>
             <w:tcMar>
               <w:top w:type="dxa" w:w="100"/>
@@ -981,6 +950,7 @@
       <w:tr>
         <w:tc>
           <w:tcPr>
+            <w:tcW w:type="dxa" w:w="1900"/>
             <w:shd w:fill="FCFDFC" w:color="auto" w:val="clear"/>
             <w:tcMar>
               <w:top w:type="dxa" w:w="100"/>
@@ -1006,6 +976,7 @@
         </w:tc>
         <w:tc>
           <w:tcPr>
+            <w:tcW w:type="dxa" w:w="5200"/>
             <w:shd w:fill="FCFDFC" w:color="auto" w:val="clear"/>
             <w:tcMar>
               <w:top w:type="dxa" w:w="100"/>
@@ -1031,6 +1002,7 @@
         </w:tc>
         <w:tc>
           <w:tcPr>
+            <w:tcW w:type="dxa" w:w="1300"/>
             <w:shd w:fill="FCFDFC" w:color="auto" w:val="clear"/>
             <w:tcMar>
               <w:top w:type="dxa" w:w="100"/>
@@ -1058,6 +1030,7 @@
       <w:tr>
         <w:tc>
           <w:tcPr>
+            <w:tcW w:type="dxa" w:w="1900"/>
             <w:shd w:fill="FCFDFC" w:color="auto" w:val="clear"/>
             <w:tcMar>
               <w:top w:type="dxa" w:w="100"/>
@@ -1083,6 +1056,7 @@
         </w:tc>
         <w:tc>
           <w:tcPr>
+            <w:tcW w:type="dxa" w:w="5200"/>
             <w:shd w:fill="FCFDFC" w:color="auto" w:val="clear"/>
             <w:tcMar>
               <w:top w:type="dxa" w:w="100"/>
@@ -1108,6 +1082,7 @@
         </w:tc>
         <w:tc>
           <w:tcPr>
+            <w:tcW w:type="dxa" w:w="1300"/>
             <w:shd w:fill="FCFDFC" w:color="auto" w:val="clear"/>
             <w:tcMar>
               <w:top w:type="dxa" w:w="100"/>
@@ -1135,6 +1110,7 @@
       <w:tr>
         <w:tc>
           <w:tcPr>
+            <w:tcW w:type="dxa" w:w="1900"/>
             <w:shd w:fill="FCFDFC" w:color="auto" w:val="clear"/>
             <w:tcMar>
               <w:top w:type="dxa" w:w="100"/>
@@ -1160,6 +1136,7 @@
         </w:tc>
         <w:tc>
           <w:tcPr>
+            <w:tcW w:type="dxa" w:w="5200"/>
             <w:shd w:fill="FCFDFC" w:color="auto" w:val="clear"/>
             <w:tcMar>
               <w:top w:type="dxa" w:w="100"/>
@@ -1185,6 +1162,7 @@
         </w:tc>
         <w:tc>
           <w:tcPr>
+            <w:tcW w:type="dxa" w:w="1300"/>
             <w:shd w:fill="FCFDFC" w:color="auto" w:val="clear"/>
             <w:tcMar>
               <w:top w:type="dxa" w:w="100"/>
@@ -1212,6 +1190,7 @@
       <w:tr>
         <w:tc>
           <w:tcPr>
+            <w:tcW w:type="dxa" w:w="1900"/>
             <w:shd w:fill="FCFDFC" w:color="auto" w:val="clear"/>
             <w:tcMar>
               <w:top w:type="dxa" w:w="100"/>
@@ -1237,6 +1216,7 @@
         </w:tc>
         <w:tc>
           <w:tcPr>
+            <w:tcW w:type="dxa" w:w="5200"/>
             <w:shd w:fill="FCFDFC" w:color="auto" w:val="clear"/>
             <w:tcMar>
               <w:top w:type="dxa" w:w="100"/>
@@ -1262,6 +1242,7 @@
         </w:tc>
         <w:tc>
           <w:tcPr>
+            <w:tcW w:type="dxa" w:w="1300"/>
             <w:shd w:fill="FCFDFC" w:color="auto" w:val="clear"/>
             <w:tcMar>
               <w:top w:type="dxa" w:w="100"/>
@@ -1289,6 +1270,7 @@
       <w:tr>
         <w:tc>
           <w:tcPr>
+            <w:tcW w:type="dxa" w:w="1900"/>
             <w:shd w:fill="FCFDFC" w:color="auto" w:val="clear"/>
             <w:tcMar>
               <w:top w:type="dxa" w:w="100"/>
@@ -1314,6 +1296,7 @@
         </w:tc>
         <w:tc>
           <w:tcPr>
+            <w:tcW w:type="dxa" w:w="5200"/>
             <w:shd w:fill="FCFDFC" w:color="auto" w:val="clear"/>
             <w:tcMar>
               <w:top w:type="dxa" w:w="100"/>
@@ -1339,6 +1322,7 @@
         </w:tc>
         <w:tc>
           <w:tcPr>
+            <w:tcW w:type="dxa" w:w="1300"/>
             <w:shd w:fill="FCFDFC" w:color="auto" w:val="clear"/>
             <w:tcMar>
               <w:top w:type="dxa" w:w="100"/>
@@ -1576,7 +1560,7 @@
     </w:p>
     <w:tbl>
       <w:tblPr>
-        <w:tblW w:type="pct" w:w="100%"/>
+        <w:tblW w:type="dxa" w:w="8400"/>
         <w:tblBorders>
           <w:top w:val="single" w:color="DCE5E8" w:sz="4"/>
           <w:left w:val="single" w:color="DCE5E8" w:sz="4"/>
@@ -1597,6 +1581,7 @@
         </w:trPr>
         <w:tc>
           <w:tcPr>
+            <w:tcW w:type="dxa" w:w="1600"/>
             <w:shd w:fill="17324D" w:color="auto" w:val="clear"/>
             <w:tcMar>
               <w:top w:type="dxa" w:w="100"/>
@@ -1622,6 +1607,7 @@
         </w:tc>
         <w:tc>
           <w:tcPr>
+            <w:tcW w:type="dxa" w:w="3000"/>
             <w:shd w:fill="17324D" w:color="auto" w:val="clear"/>
             <w:tcMar>
               <w:top w:type="dxa" w:w="100"/>
@@ -1647,6 +1633,7 @@
         </w:tc>
         <w:tc>
           <w:tcPr>
+            <w:tcW w:type="dxa" w:w="3800"/>
             <w:shd w:fill="17324D" w:color="auto" w:val="clear"/>
             <w:tcMar>
               <w:top w:type="dxa" w:w="100"/>
@@ -1674,6 +1661,7 @@
       <w:tr>
         <w:tc>
           <w:tcPr>
+            <w:tcW w:type="dxa" w:w="1600"/>
             <w:shd w:fill="FCFDFC" w:color="auto" w:val="clear"/>
             <w:tcMar>
               <w:top w:type="dxa" w:w="100"/>
@@ -1699,6 +1687,7 @@
         </w:tc>
         <w:tc>
           <w:tcPr>
+            <w:tcW w:type="dxa" w:w="3000"/>
             <w:shd w:fill="FCFDFC" w:color="auto" w:val="clear"/>
             <w:tcMar>
               <w:top w:type="dxa" w:w="100"/>
@@ -1724,6 +1713,7 @@
         </w:tc>
         <w:tc>
           <w:tcPr>
+            <w:tcW w:type="dxa" w:w="3800"/>
             <w:shd w:fill="FCFDFC" w:color="auto" w:val="clear"/>
             <w:tcMar>
               <w:top w:type="dxa" w:w="100"/>
@@ -1751,6 +1741,7 @@
       <w:tr>
         <w:tc>
           <w:tcPr>
+            <w:tcW w:type="dxa" w:w="1600"/>
             <w:shd w:fill="FCFDFC" w:color="auto" w:val="clear"/>
             <w:tcMar>
               <w:top w:type="dxa" w:w="100"/>
@@ -1776,6 +1767,7 @@
         </w:tc>
         <w:tc>
           <w:tcPr>
+            <w:tcW w:type="dxa" w:w="3000"/>
             <w:shd w:fill="FCFDFC" w:color="auto" w:val="clear"/>
             <w:tcMar>
               <w:top w:type="dxa" w:w="100"/>
@@ -1801,6 +1793,7 @@
         </w:tc>
         <w:tc>
           <w:tcPr>
+            <w:tcW w:type="dxa" w:w="3800"/>
             <w:shd w:fill="FCFDFC" w:color="auto" w:val="clear"/>
             <w:tcMar>
               <w:top w:type="dxa" w:w="100"/>
@@ -1828,6 +1821,7 @@
       <w:tr>
         <w:tc>
           <w:tcPr>
+            <w:tcW w:type="dxa" w:w="1600"/>
             <w:shd w:fill="FCFDFC" w:color="auto" w:val="clear"/>
             <w:tcMar>
               <w:top w:type="dxa" w:w="100"/>
@@ -1853,6 +1847,7 @@
         </w:tc>
         <w:tc>
           <w:tcPr>
+            <w:tcW w:type="dxa" w:w="3000"/>
             <w:shd w:fill="FCFDFC" w:color="auto" w:val="clear"/>
             <w:tcMar>
               <w:top w:type="dxa" w:w="100"/>
@@ -1878,6 +1873,7 @@
         </w:tc>
         <w:tc>
           <w:tcPr>
+            <w:tcW w:type="dxa" w:w="3800"/>
             <w:shd w:fill="FCFDFC" w:color="auto" w:val="clear"/>
             <w:tcMar>
               <w:top w:type="dxa" w:w="100"/>
@@ -1905,6 +1901,7 @@
       <w:tr>
         <w:tc>
           <w:tcPr>
+            <w:tcW w:type="dxa" w:w="1600"/>
             <w:shd w:fill="FCFDFC" w:color="auto" w:val="clear"/>
             <w:tcMar>
               <w:top w:type="dxa" w:w="100"/>
@@ -1930,6 +1927,7 @@
         </w:tc>
         <w:tc>
           <w:tcPr>
+            <w:tcW w:type="dxa" w:w="3000"/>
             <w:shd w:fill="FCFDFC" w:color="auto" w:val="clear"/>
             <w:tcMar>
               <w:top w:type="dxa" w:w="100"/>
@@ -1955,6 +1953,7 @@
         </w:tc>
         <w:tc>
           <w:tcPr>
+            <w:tcW w:type="dxa" w:w="3800"/>
             <w:shd w:fill="FCFDFC" w:color="auto" w:val="clear"/>
             <w:tcMar>
               <w:top w:type="dxa" w:w="100"/>
@@ -1982,6 +1981,7 @@
       <w:tr>
         <w:tc>
           <w:tcPr>
+            <w:tcW w:type="dxa" w:w="1600"/>
             <w:shd w:fill="FCFDFC" w:color="auto" w:val="clear"/>
             <w:tcMar>
               <w:top w:type="dxa" w:w="100"/>
@@ -2007,6 +2007,7 @@
         </w:tc>
         <w:tc>
           <w:tcPr>
+            <w:tcW w:type="dxa" w:w="3000"/>
             <w:shd w:fill="FCFDFC" w:color="auto" w:val="clear"/>
             <w:tcMar>
               <w:top w:type="dxa" w:w="100"/>
@@ -2032,6 +2033,7 @@
         </w:tc>
         <w:tc>
           <w:tcPr>
+            <w:tcW w:type="dxa" w:w="3800"/>
             <w:shd w:fill="FCFDFC" w:color="auto" w:val="clear"/>
             <w:tcMar>
               <w:top w:type="dxa" w:w="100"/>
@@ -2059,6 +2061,7 @@
       <w:tr>
         <w:tc>
           <w:tcPr>
+            <w:tcW w:type="dxa" w:w="1600"/>
             <w:shd w:fill="FCFDFC" w:color="auto" w:val="clear"/>
             <w:tcMar>
               <w:top w:type="dxa" w:w="100"/>
@@ -2084,6 +2087,7 @@
         </w:tc>
         <w:tc>
           <w:tcPr>
+            <w:tcW w:type="dxa" w:w="3000"/>
             <w:shd w:fill="FCFDFC" w:color="auto" w:val="clear"/>
             <w:tcMar>
               <w:top w:type="dxa" w:w="100"/>
@@ -2109,6 +2113,7 @@
         </w:tc>
         <w:tc>
           <w:tcPr>
+            <w:tcW w:type="dxa" w:w="3800"/>
             <w:shd w:fill="FCFDFC" w:color="auto" w:val="clear"/>
             <w:tcMar>
               <w:top w:type="dxa" w:w="100"/>
@@ -2218,7 +2223,7 @@
     </w:p>
     <w:tbl>
       <w:tblPr>
-        <w:tblW w:type="pct" w:w="100%"/>
+        <w:tblW w:type="dxa" w:w="8400"/>
         <w:tblBorders>
           <w:top w:val="single" w:color="DCE5E8" w:sz="4"/>
           <w:left w:val="single" w:color="DCE5E8" w:sz="4"/>
@@ -2239,6 +2244,7 @@
         </w:trPr>
         <w:tc>
           <w:tcPr>
+            <w:tcW w:type="dxa" w:w="1500"/>
             <w:shd w:fill="17324D" w:color="auto" w:val="clear"/>
             <w:tcMar>
               <w:top w:type="dxa" w:w="100"/>
@@ -2264,6 +2270,7 @@
         </w:tc>
         <w:tc>
           <w:tcPr>
+            <w:tcW w:type="dxa" w:w="3500"/>
             <w:shd w:fill="17324D" w:color="auto" w:val="clear"/>
             <w:tcMar>
               <w:top w:type="dxa" w:w="100"/>
@@ -2289,6 +2296,7 @@
         </w:tc>
         <w:tc>
           <w:tcPr>
+            <w:tcW w:type="dxa" w:w="3400"/>
             <w:shd w:fill="17324D" w:color="auto" w:val="clear"/>
             <w:tcMar>
               <w:top w:type="dxa" w:w="100"/>
@@ -2316,6 +2324,7 @@
       <w:tr>
         <w:tc>
           <w:tcPr>
+            <w:tcW w:type="dxa" w:w="1500"/>
             <w:shd w:fill="FCFDFC" w:color="auto" w:val="clear"/>
             <w:tcMar>
               <w:top w:type="dxa" w:w="100"/>
@@ -2341,6 +2350,7 @@
         </w:tc>
         <w:tc>
           <w:tcPr>
+            <w:tcW w:type="dxa" w:w="3500"/>
             <w:shd w:fill="FCFDFC" w:color="auto" w:val="clear"/>
             <w:tcMar>
               <w:top w:type="dxa" w:w="100"/>
@@ -2366,6 +2376,7 @@
         </w:tc>
         <w:tc>
           <w:tcPr>
+            <w:tcW w:type="dxa" w:w="3400"/>
             <w:shd w:fill="FCFDFC" w:color="auto" w:val="clear"/>
             <w:tcMar>
               <w:top w:type="dxa" w:w="100"/>
@@ -2393,6 +2404,7 @@
       <w:tr>
         <w:tc>
           <w:tcPr>
+            <w:tcW w:type="dxa" w:w="1500"/>
             <w:shd w:fill="FCFDFC" w:color="auto" w:val="clear"/>
             <w:tcMar>
               <w:top w:type="dxa" w:w="100"/>
@@ -2418,6 +2430,7 @@
         </w:tc>
         <w:tc>
           <w:tcPr>
+            <w:tcW w:type="dxa" w:w="3500"/>
             <w:shd w:fill="FCFDFC" w:color="auto" w:val="clear"/>
             <w:tcMar>
               <w:top w:type="dxa" w:w="100"/>
@@ -2443,6 +2456,7 @@
         </w:tc>
         <w:tc>
           <w:tcPr>
+            <w:tcW w:type="dxa" w:w="3400"/>
             <w:shd w:fill="FCFDFC" w:color="auto" w:val="clear"/>
             <w:tcMar>
               <w:top w:type="dxa" w:w="100"/>
@@ -2470,6 +2484,7 @@
       <w:tr>
         <w:tc>
           <w:tcPr>
+            <w:tcW w:type="dxa" w:w="1500"/>
             <w:shd w:fill="FCFDFC" w:color="auto" w:val="clear"/>
             <w:tcMar>
               <w:top w:type="dxa" w:w="100"/>
@@ -2495,6 +2510,7 @@
         </w:tc>
         <w:tc>
           <w:tcPr>
+            <w:tcW w:type="dxa" w:w="3500"/>
             <w:shd w:fill="FCFDFC" w:color="auto" w:val="clear"/>
             <w:tcMar>
               <w:top w:type="dxa" w:w="100"/>
@@ -2520,6 +2536,7 @@
         </w:tc>
         <w:tc>
           <w:tcPr>
+            <w:tcW w:type="dxa" w:w="3400"/>
             <w:shd w:fill="FCFDFC" w:color="auto" w:val="clear"/>
             <w:tcMar>
               <w:top w:type="dxa" w:w="100"/>
@@ -2547,6 +2564,7 @@
       <w:tr>
         <w:tc>
           <w:tcPr>
+            <w:tcW w:type="dxa" w:w="1500"/>
             <w:shd w:fill="FCFDFC" w:color="auto" w:val="clear"/>
             <w:tcMar>
               <w:top w:type="dxa" w:w="100"/>
@@ -2572,6 +2590,7 @@
         </w:tc>
         <w:tc>
           <w:tcPr>
+            <w:tcW w:type="dxa" w:w="3500"/>
             <w:shd w:fill="FCFDFC" w:color="auto" w:val="clear"/>
             <w:tcMar>
               <w:top w:type="dxa" w:w="100"/>
@@ -2597,6 +2616,7 @@
         </w:tc>
         <w:tc>
           <w:tcPr>
+            <w:tcW w:type="dxa" w:w="3400"/>
             <w:shd w:fill="FCFDFC" w:color="auto" w:val="clear"/>
             <w:tcMar>
               <w:top w:type="dxa" w:w="100"/>
@@ -2624,6 +2644,7 @@
       <w:tr>
         <w:tc>
           <w:tcPr>
+            <w:tcW w:type="dxa" w:w="1500"/>
             <w:shd w:fill="FCFDFC" w:color="auto" w:val="clear"/>
             <w:tcMar>
               <w:top w:type="dxa" w:w="100"/>
@@ -2649,6 +2670,7 @@
         </w:tc>
         <w:tc>
           <w:tcPr>
+            <w:tcW w:type="dxa" w:w="3500"/>
             <w:shd w:fill="FCFDFC" w:color="auto" w:val="clear"/>
             <w:tcMar>
               <w:top w:type="dxa" w:w="100"/>
@@ -2674,6 +2696,7 @@
         </w:tc>
         <w:tc>
           <w:tcPr>
+            <w:tcW w:type="dxa" w:w="3400"/>
             <w:shd w:fill="FCFDFC" w:color="auto" w:val="clear"/>
             <w:tcMar>
               <w:top w:type="dxa" w:w="100"/>
@@ -3196,7 +3219,7 @@
     </w:p>
     <w:tbl>
       <w:tblPr>
-        <w:tblW w:type="pct" w:w="100%"/>
+        <w:tblW w:type="dxa" w:w="8400"/>
         <w:tblBorders>
           <w:top w:val="single" w:color="DCE5E8" w:sz="4"/>
           <w:left w:val="single" w:color="DCE5E8" w:sz="4"/>
@@ -3217,6 +3240,7 @@
         </w:trPr>
         <w:tc>
           <w:tcPr>
+            <w:tcW w:type="dxa" w:w="1800"/>
             <w:shd w:fill="17324D" w:color="auto" w:val="clear"/>
             <w:tcMar>
               <w:top w:type="dxa" w:w="100"/>
@@ -3242,6 +3266,7 @@
         </w:tc>
         <w:tc>
           <w:tcPr>
+            <w:tcW w:type="dxa" w:w="5000"/>
             <w:shd w:fill="17324D" w:color="auto" w:val="clear"/>
             <w:tcMar>
               <w:top w:type="dxa" w:w="100"/>
@@ -3267,6 +3292,7 @@
         </w:tc>
         <w:tc>
           <w:tcPr>
+            <w:tcW w:type="dxa" w:w="1600"/>
             <w:shd w:fill="17324D" w:color="auto" w:val="clear"/>
             <w:tcMar>
               <w:top w:type="dxa" w:w="100"/>
@@ -3294,6 +3320,7 @@
       <w:tr>
         <w:tc>
           <w:tcPr>
+            <w:tcW w:type="dxa" w:w="1800"/>
             <w:shd w:fill="FCFDFC" w:color="auto" w:val="clear"/>
             <w:tcMar>
               <w:top w:type="dxa" w:w="100"/>
@@ -3319,6 +3346,7 @@
         </w:tc>
         <w:tc>
           <w:tcPr>
+            <w:tcW w:type="dxa" w:w="5000"/>
             <w:shd w:fill="FCFDFC" w:color="auto" w:val="clear"/>
             <w:tcMar>
               <w:top w:type="dxa" w:w="100"/>
@@ -3344,6 +3372,7 @@
         </w:tc>
         <w:tc>
           <w:tcPr>
+            <w:tcW w:type="dxa" w:w="1600"/>
             <w:shd w:fill="FCFDFC" w:color="auto" w:val="clear"/>
             <w:tcMar>
               <w:top w:type="dxa" w:w="100"/>
@@ -3371,6 +3400,7 @@
       <w:tr>
         <w:tc>
           <w:tcPr>
+            <w:tcW w:type="dxa" w:w="1800"/>
             <w:shd w:fill="FCFDFC" w:color="auto" w:val="clear"/>
             <w:tcMar>
               <w:top w:type="dxa" w:w="100"/>
@@ -3396,6 +3426,7 @@
         </w:tc>
         <w:tc>
           <w:tcPr>
+            <w:tcW w:type="dxa" w:w="5000"/>
             <w:shd w:fill="FCFDFC" w:color="auto" w:val="clear"/>
             <w:tcMar>
               <w:top w:type="dxa" w:w="100"/>
@@ -3421,6 +3452,7 @@
         </w:tc>
         <w:tc>
           <w:tcPr>
+            <w:tcW w:type="dxa" w:w="1600"/>
             <w:shd w:fill="FCFDFC" w:color="auto" w:val="clear"/>
             <w:tcMar>
               <w:top w:type="dxa" w:w="100"/>
@@ -3448,6 +3480,7 @@
       <w:tr>
         <w:tc>
           <w:tcPr>
+            <w:tcW w:type="dxa" w:w="1800"/>
             <w:shd w:fill="FCFDFC" w:color="auto" w:val="clear"/>
             <w:tcMar>
               <w:top w:type="dxa" w:w="100"/>
@@ -3473,6 +3506,7 @@
         </w:tc>
         <w:tc>
           <w:tcPr>
+            <w:tcW w:type="dxa" w:w="5000"/>
             <w:shd w:fill="FCFDFC" w:color="auto" w:val="clear"/>
             <w:tcMar>
               <w:top w:type="dxa" w:w="100"/>
@@ -3498,6 +3532,7 @@
         </w:tc>
         <w:tc>
           <w:tcPr>
+            <w:tcW w:type="dxa" w:w="1600"/>
             <w:shd w:fill="FCFDFC" w:color="auto" w:val="clear"/>
             <w:tcMar>
               <w:top w:type="dxa" w:w="100"/>
@@ -3525,6 +3560,7 @@
       <w:tr>
         <w:tc>
           <w:tcPr>
+            <w:tcW w:type="dxa" w:w="1800"/>
             <w:shd w:fill="FCFDFC" w:color="auto" w:val="clear"/>
             <w:tcMar>
               <w:top w:type="dxa" w:w="100"/>
@@ -3550,6 +3586,7 @@
         </w:tc>
         <w:tc>
           <w:tcPr>
+            <w:tcW w:type="dxa" w:w="5000"/>
             <w:shd w:fill="FCFDFC" w:color="auto" w:val="clear"/>
             <w:tcMar>
               <w:top w:type="dxa" w:w="100"/>
@@ -3575,6 +3612,7 @@
         </w:tc>
         <w:tc>
           <w:tcPr>
+            <w:tcW w:type="dxa" w:w="1600"/>
             <w:shd w:fill="FCFDFC" w:color="auto" w:val="clear"/>
             <w:tcMar>
               <w:top w:type="dxa" w:w="100"/>
@@ -3611,7 +3649,7 @@
     </w:p>
     <w:tbl>
       <w:tblPr>
-        <w:tblW w:type="pct" w:w="100%"/>
+        <w:tblW w:type="dxa" w:w="8400"/>
         <w:tblBorders>
           <w:top w:val="single" w:color="DCE5E8" w:sz="4"/>
           <w:left w:val="single" w:color="DCE5E8" w:sz="4"/>
@@ -3632,6 +3670,7 @@
         </w:trPr>
         <w:tc>
           <w:tcPr>
+            <w:tcW w:type="dxa" w:w="1000"/>
             <w:shd w:fill="17324D" w:color="auto" w:val="clear"/>
             <w:tcMar>
               <w:top w:type="dxa" w:w="100"/>
@@ -3657,6 +3696,7 @@
         </w:tc>
         <w:tc>
           <w:tcPr>
+            <w:tcW w:type="dxa" w:w="4100"/>
             <w:shd w:fill="17324D" w:color="auto" w:val="clear"/>
             <w:tcMar>
               <w:top w:type="dxa" w:w="100"/>
@@ -3682,6 +3722,7 @@
         </w:tc>
         <w:tc>
           <w:tcPr>
+            <w:tcW w:type="dxa" w:w="3300"/>
             <w:shd w:fill="17324D" w:color="auto" w:val="clear"/>
             <w:tcMar>
               <w:top w:type="dxa" w:w="100"/>
@@ -3709,6 +3750,7 @@
       <w:tr>
         <w:tc>
           <w:tcPr>
+            <w:tcW w:type="dxa" w:w="1000"/>
             <w:shd w:fill="FCFDFC" w:color="auto" w:val="clear"/>
             <w:tcMar>
               <w:top w:type="dxa" w:w="100"/>
@@ -3734,6 +3776,7 @@
         </w:tc>
         <w:tc>
           <w:tcPr>
+            <w:tcW w:type="dxa" w:w="4100"/>
             <w:shd w:fill="FCFDFC" w:color="auto" w:val="clear"/>
             <w:tcMar>
               <w:top w:type="dxa" w:w="100"/>
@@ -3759,6 +3802,7 @@
         </w:tc>
         <w:tc>
           <w:tcPr>
+            <w:tcW w:type="dxa" w:w="3300"/>
             <w:shd w:fill="FCFDFC" w:color="auto" w:val="clear"/>
             <w:tcMar>
               <w:top w:type="dxa" w:w="100"/>
@@ -3786,6 +3830,7 @@
       <w:tr>
         <w:tc>
           <w:tcPr>
+            <w:tcW w:type="dxa" w:w="1000"/>
             <w:shd w:fill="FCFDFC" w:color="auto" w:val="clear"/>
             <w:tcMar>
               <w:top w:type="dxa" w:w="100"/>
@@ -3811,6 +3856,7 @@
         </w:tc>
         <w:tc>
           <w:tcPr>
+            <w:tcW w:type="dxa" w:w="4100"/>
             <w:shd w:fill="FCFDFC" w:color="auto" w:val="clear"/>
             <w:tcMar>
               <w:top w:type="dxa" w:w="100"/>
@@ -3836,6 +3882,7 @@
         </w:tc>
         <w:tc>
           <w:tcPr>
+            <w:tcW w:type="dxa" w:w="3300"/>
             <w:shd w:fill="FCFDFC" w:color="auto" w:val="clear"/>
             <w:tcMar>
               <w:top w:type="dxa" w:w="100"/>
@@ -3863,6 +3910,7 @@
       <w:tr>
         <w:tc>
           <w:tcPr>
+            <w:tcW w:type="dxa" w:w="1000"/>
             <w:shd w:fill="FCFDFC" w:color="auto" w:val="clear"/>
             <w:tcMar>
               <w:top w:type="dxa" w:w="100"/>
@@ -3888,6 +3936,7 @@
         </w:tc>
         <w:tc>
           <w:tcPr>
+            <w:tcW w:type="dxa" w:w="4100"/>
             <w:shd w:fill="FCFDFC" w:color="auto" w:val="clear"/>
             <w:tcMar>
               <w:top w:type="dxa" w:w="100"/>
@@ -3913,6 +3962,7 @@
         </w:tc>
         <w:tc>
           <w:tcPr>
+            <w:tcW w:type="dxa" w:w="3300"/>
             <w:shd w:fill="FCFDFC" w:color="auto" w:val="clear"/>
             <w:tcMar>
               <w:top w:type="dxa" w:w="100"/>
@@ -3940,6 +3990,7 @@
       <w:tr>
         <w:tc>
           <w:tcPr>
+            <w:tcW w:type="dxa" w:w="1000"/>
             <w:shd w:fill="FCFDFC" w:color="auto" w:val="clear"/>
             <w:tcMar>
               <w:top w:type="dxa" w:w="100"/>
@@ -3965,6 +4016,7 @@
         </w:tc>
         <w:tc>
           <w:tcPr>
+            <w:tcW w:type="dxa" w:w="4100"/>
             <w:shd w:fill="FCFDFC" w:color="auto" w:val="clear"/>
             <w:tcMar>
               <w:top w:type="dxa" w:w="100"/>
@@ -3990,6 +4042,7 @@
         </w:tc>
         <w:tc>
           <w:tcPr>
+            <w:tcW w:type="dxa" w:w="3300"/>
             <w:shd w:fill="FCFDFC" w:color="auto" w:val="clear"/>
             <w:tcMar>
               <w:top w:type="dxa" w:w="100"/>
@@ -4017,6 +4070,7 @@
       <w:tr>
         <w:tc>
           <w:tcPr>
+            <w:tcW w:type="dxa" w:w="1000"/>
             <w:shd w:fill="FCFDFC" w:color="auto" w:val="clear"/>
             <w:tcMar>
               <w:top w:type="dxa" w:w="100"/>
@@ -4042,6 +4096,7 @@
         </w:tc>
         <w:tc>
           <w:tcPr>
+            <w:tcW w:type="dxa" w:w="4100"/>
             <w:shd w:fill="FCFDFC" w:color="auto" w:val="clear"/>
             <w:tcMar>
               <w:top w:type="dxa" w:w="100"/>
@@ -4067,6 +4122,7 @@
         </w:tc>
         <w:tc>
           <w:tcPr>
+            <w:tcW w:type="dxa" w:w="3300"/>
             <w:shd w:fill="FCFDFC" w:color="auto" w:val="clear"/>
             <w:tcMar>
               <w:top w:type="dxa" w:w="100"/>
@@ -4094,6 +4150,7 @@
       <w:tr>
         <w:tc>
           <w:tcPr>
+            <w:tcW w:type="dxa" w:w="1000"/>
             <w:shd w:fill="FCFDFC" w:color="auto" w:val="clear"/>
             <w:tcMar>
               <w:top w:type="dxa" w:w="100"/>
@@ -4119,6 +4176,7 @@
         </w:tc>
         <w:tc>
           <w:tcPr>
+            <w:tcW w:type="dxa" w:w="4100"/>
             <w:shd w:fill="FCFDFC" w:color="auto" w:val="clear"/>
             <w:tcMar>
               <w:top w:type="dxa" w:w="100"/>
@@ -4144,6 +4202,7 @@
         </w:tc>
         <w:tc>
           <w:tcPr>
+            <w:tcW w:type="dxa" w:w="3300"/>
             <w:shd w:fill="FCFDFC" w:color="auto" w:val="clear"/>
             <w:tcMar>
               <w:top w:type="dxa" w:w="100"/>
@@ -4171,6 +4230,7 @@
       <w:tr>
         <w:tc>
           <w:tcPr>
+            <w:tcW w:type="dxa" w:w="1000"/>
             <w:shd w:fill="FCFDFC" w:color="auto" w:val="clear"/>
             <w:tcMar>
               <w:top w:type="dxa" w:w="100"/>
@@ -4196,6 +4256,7 @@
         </w:tc>
         <w:tc>
           <w:tcPr>
+            <w:tcW w:type="dxa" w:w="4100"/>
             <w:shd w:fill="FCFDFC" w:color="auto" w:val="clear"/>
             <w:tcMar>
               <w:top w:type="dxa" w:w="100"/>
@@ -4221,6 +4282,7 @@
         </w:tc>
         <w:tc>
           <w:tcPr>
+            <w:tcW w:type="dxa" w:w="3300"/>
             <w:shd w:fill="FCFDFC" w:color="auto" w:val="clear"/>
             <w:tcMar>
               <w:top w:type="dxa" w:w="100"/>
@@ -4437,7 +4499,7 @@
     </w:p>
     <w:tbl>
       <w:tblPr>
-        <w:tblW w:type="pct" w:w="100%"/>
+        <w:tblW w:type="dxa" w:w="8700"/>
         <w:tblBorders>
           <w:top w:val="single" w:color="DCE5E8" w:sz="4"/>
           <w:left w:val="single" w:color="DCE5E8" w:sz="4"/>
@@ -4459,6 +4521,7 @@
         </w:trPr>
         <w:tc>
           <w:tcPr>
+            <w:tcW w:type="dxa" w:w="1800"/>
             <w:shd w:fill="17324D" w:color="auto" w:val="clear"/>
             <w:tcMar>
               <w:top w:type="dxa" w:w="100"/>
@@ -4484,6 +4547,7 @@
         </w:tc>
         <w:tc>
           <w:tcPr>
+            <w:tcW w:type="dxa" w:w="1800"/>
             <w:shd w:fill="17324D" w:color="auto" w:val="clear"/>
             <w:tcMar>
               <w:top w:type="dxa" w:w="100"/>
@@ -4509,6 +4573,7 @@
         </w:tc>
         <w:tc>
           <w:tcPr>
+            <w:tcW w:type="dxa" w:w="3900"/>
             <w:shd w:fill="17324D" w:color="auto" w:val="clear"/>
             <w:tcMar>
               <w:top w:type="dxa" w:w="100"/>
@@ -4534,6 +4599,7 @@
         </w:tc>
         <w:tc>
           <w:tcPr>
+            <w:tcW w:type="dxa" w:w="1200"/>
             <w:shd w:fill="17324D" w:color="auto" w:val="clear"/>
             <w:tcMar>
               <w:top w:type="dxa" w:w="100"/>
@@ -4561,101 +4627,105 @@
       <w:tr>
         <w:tc>
           <w:tcPr>
-            <w:shd w:fill="FCFDFC" w:color="auto" w:val="clear"/>
-            <w:tcMar>
-              <w:top w:type="dxa" w:w="100"/>
-              <w:left w:type="dxa" w:w="120"/>
-              <w:bottom w:type="dxa" w:w="100"/>
-              <w:right w:type="dxa" w:w="120"/>
-            </w:tcMar>
-            <w:vAlign w:val="center"/>
-          </w:tcPr>
-          <w:p>
-            <w:r>
-              <w:rPr>
-                <w:rFonts w:ascii="Microsoft YaHei" w:cs="Microsoft YaHei" w:eastAsia="Microsoft YaHei" w:hAnsi="Microsoft YaHei"/>
-                <w:b w:val="false"/>
-                <w:bCs w:val="false"/>
-                <w:color w:val="17324D"/>
-                <w:sz w:val="19"/>
-                <w:szCs w:val="19"/>
-              </w:rPr>
-              <w:t xml:space="preserve">【请填写】</w:t>
-            </w:r>
-          </w:p>
-        </w:tc>
-        <w:tc>
-          <w:tcPr>
-            <w:shd w:fill="FCFDFC" w:color="auto" w:val="clear"/>
-            <w:tcMar>
-              <w:top w:type="dxa" w:w="100"/>
-              <w:left w:type="dxa" w:w="120"/>
-              <w:bottom w:type="dxa" w:w="100"/>
-              <w:right w:type="dxa" w:w="120"/>
-            </w:tcMar>
-            <w:vAlign w:val="center"/>
-          </w:tcPr>
-          <w:p>
-            <w:r>
-              <w:rPr>
-                <w:rFonts w:ascii="Microsoft YaHei" w:cs="Microsoft YaHei" w:eastAsia="Microsoft YaHei" w:hAnsi="Microsoft YaHei"/>
-                <w:b w:val="false"/>
-                <w:bCs w:val="false"/>
-                <w:color w:val="17324D"/>
-                <w:sz w:val="19"/>
-                <w:szCs w:val="19"/>
-              </w:rPr>
-              <w:t xml:space="preserve">【请填写】</w:t>
-            </w:r>
-          </w:p>
-        </w:tc>
-        <w:tc>
-          <w:tcPr>
-            <w:shd w:fill="FCFDFC" w:color="auto" w:val="clear"/>
-            <w:tcMar>
-              <w:top w:type="dxa" w:w="100"/>
-              <w:left w:type="dxa" w:w="120"/>
-              <w:bottom w:type="dxa" w:w="100"/>
-              <w:right w:type="dxa" w:w="120"/>
-            </w:tcMar>
-            <w:vAlign w:val="center"/>
-          </w:tcPr>
-          <w:p>
-            <w:r>
-              <w:rPr>
-                <w:rFonts w:ascii="Microsoft YaHei" w:cs="Microsoft YaHei" w:eastAsia="Microsoft YaHei" w:hAnsi="Microsoft YaHei"/>
-                <w:b w:val="false"/>
-                <w:bCs w:val="false"/>
-                <w:color w:val="17324D"/>
-                <w:sz w:val="19"/>
-                <w:szCs w:val="19"/>
-              </w:rPr>
-              <w:t xml:space="preserve">需求分析、体系结构设计、前端实现、测试与文档</w:t>
-            </w:r>
-          </w:p>
-        </w:tc>
-        <w:tc>
-          <w:tcPr>
-            <w:shd w:fill="FCFDFC" w:color="auto" w:val="clear"/>
-            <w:tcMar>
-              <w:top w:type="dxa" w:w="100"/>
-              <w:left w:type="dxa" w:w="120"/>
-              <w:bottom w:type="dxa" w:w="100"/>
-              <w:right w:type="dxa" w:w="120"/>
-            </w:tcMar>
-            <w:vAlign w:val="center"/>
-          </w:tcPr>
-          <w:p>
-            <w:r>
-              <w:rPr>
-                <w:rFonts w:ascii="Microsoft YaHei" w:cs="Microsoft YaHei" w:eastAsia="Microsoft YaHei" w:hAnsi="Microsoft YaHei"/>
-                <w:b w:val="false"/>
-                <w:bCs w:val="false"/>
-                <w:color w:val="17324D"/>
-                <w:sz w:val="19"/>
-                <w:szCs w:val="19"/>
-              </w:rPr>
-              <w:t xml:space="preserve">100%（个人项目）</w:t>
+            <w:tcW w:type="dxa" w:w="1800"/>
+            <w:shd w:fill="FCFDFC" w:color="auto" w:val="clear"/>
+            <w:tcMar>
+              <w:top w:type="dxa" w:w="100"/>
+              <w:left w:type="dxa" w:w="120"/>
+              <w:bottom w:type="dxa" w:w="100"/>
+              <w:right w:type="dxa" w:w="120"/>
+            </w:tcMar>
+            <w:vAlign w:val="center"/>
+          </w:tcPr>
+          <w:p>
+            <w:r>
+              <w:rPr>
+                <w:rFonts w:ascii="Microsoft YaHei" w:cs="Microsoft YaHei" w:eastAsia="Microsoft YaHei" w:hAnsi="Microsoft YaHei"/>
+                <w:b w:val="false"/>
+                <w:bCs w:val="false"/>
+                <w:color w:val="17324D"/>
+                <w:sz w:val="19"/>
+                <w:szCs w:val="19"/>
+              </w:rPr>
+              <w:t xml:space="preserve">蓝思钰</w:t>
+            </w:r>
+          </w:p>
+        </w:tc>
+        <w:tc>
+          <w:tcPr>
+            <w:tcW w:type="dxa" w:w="1800"/>
+            <w:shd w:fill="FCFDFC" w:color="auto" w:val="clear"/>
+            <w:tcMar>
+              <w:top w:type="dxa" w:w="100"/>
+              <w:left w:type="dxa" w:w="120"/>
+              <w:bottom w:type="dxa" w:w="100"/>
+              <w:right w:type="dxa" w:w="120"/>
+            </w:tcMar>
+            <w:vAlign w:val="center"/>
+          </w:tcPr>
+          <w:p>
+            <w:r>
+              <w:rPr>
+                <w:rFonts w:ascii="Microsoft YaHei" w:cs="Microsoft YaHei" w:eastAsia="Microsoft YaHei" w:hAnsi="Microsoft YaHei"/>
+                <w:b w:val="false"/>
+                <w:bCs w:val="false"/>
+                <w:color w:val="17324D"/>
+                <w:sz w:val="19"/>
+                <w:szCs w:val="19"/>
+              </w:rPr>
+              <w:t xml:space="preserve">52302042011</w:t>
+            </w:r>
+          </w:p>
+        </w:tc>
+        <w:tc>
+          <w:tcPr>
+            <w:tcW w:type="dxa" w:w="3900"/>
+            <w:shd w:fill="FCFDFC" w:color="auto" w:val="clear"/>
+            <w:tcMar>
+              <w:top w:type="dxa" w:w="100"/>
+              <w:left w:type="dxa" w:w="120"/>
+              <w:bottom w:type="dxa" w:w="100"/>
+              <w:right w:type="dxa" w:w="120"/>
+            </w:tcMar>
+            <w:vAlign w:val="center"/>
+          </w:tcPr>
+          <w:p>
+            <w:r>
+              <w:rPr>
+                <w:rFonts w:ascii="Microsoft YaHei" w:cs="Microsoft YaHei" w:eastAsia="Microsoft YaHei" w:hAnsi="Microsoft YaHei"/>
+                <w:b w:val="false"/>
+                <w:bCs w:val="false"/>
+                <w:color w:val="17324D"/>
+                <w:sz w:val="19"/>
+                <w:szCs w:val="19"/>
+              </w:rPr>
+              <w:t xml:space="preserve">需求分析、产品方案与总体设计</w:t>
+            </w:r>
+          </w:p>
+        </w:tc>
+        <w:tc>
+          <w:tcPr>
+            <w:tcW w:type="dxa" w:w="1200"/>
+            <w:shd w:fill="FCFDFC" w:color="auto" w:val="clear"/>
+            <w:tcMar>
+              <w:top w:type="dxa" w:w="100"/>
+              <w:left w:type="dxa" w:w="120"/>
+              <w:bottom w:type="dxa" w:w="100"/>
+              <w:right w:type="dxa" w:w="120"/>
+            </w:tcMar>
+            <w:vAlign w:val="center"/>
+          </w:tcPr>
+          <w:p>
+            <w:r>
+              <w:rPr>
+                <w:rFonts w:ascii="Microsoft YaHei" w:cs="Microsoft YaHei" w:eastAsia="Microsoft YaHei" w:hAnsi="Microsoft YaHei"/>
+                <w:b w:val="false"/>
+                <w:bCs w:val="false"/>
+                <w:color w:val="17324D"/>
+                <w:sz w:val="19"/>
+                <w:szCs w:val="19"/>
+              </w:rPr>
+              <w:t xml:space="preserve">20%</w:t>
             </w:r>
           </w:p>
         </w:tc>
@@ -4663,101 +4733,423 @@
       <w:tr>
         <w:tc>
           <w:tcPr>
-            <w:shd w:fill="FCFDFC" w:color="auto" w:val="clear"/>
-            <w:tcMar>
-              <w:top w:type="dxa" w:w="100"/>
-              <w:left w:type="dxa" w:w="120"/>
-              <w:bottom w:type="dxa" w:w="100"/>
-              <w:right w:type="dxa" w:w="120"/>
-            </w:tcMar>
-            <w:vAlign w:val="center"/>
-          </w:tcPr>
-          <w:p>
-            <w:r>
-              <w:rPr>
-                <w:rFonts w:ascii="Microsoft YaHei" w:cs="Microsoft YaHei" w:eastAsia="Microsoft YaHei" w:hAnsi="Microsoft YaHei"/>
-                <w:b w:val="false"/>
-                <w:bCs w:val="false"/>
-                <w:color w:val="17324D"/>
-                <w:sz w:val="19"/>
-                <w:szCs w:val="19"/>
-              </w:rPr>
-              <w:t xml:space="preserve">【如为小组请新增】</w:t>
-            </w:r>
-          </w:p>
-        </w:tc>
-        <w:tc>
-          <w:tcPr>
-            <w:shd w:fill="FCFDFC" w:color="auto" w:val="clear"/>
-            <w:tcMar>
-              <w:top w:type="dxa" w:w="100"/>
-              <w:left w:type="dxa" w:w="120"/>
-              <w:bottom w:type="dxa" w:w="100"/>
-              <w:right w:type="dxa" w:w="120"/>
-            </w:tcMar>
-            <w:vAlign w:val="center"/>
-          </w:tcPr>
-          <w:p>
-            <w:r>
-              <w:rPr>
-                <w:rFonts w:ascii="Microsoft YaHei" w:cs="Microsoft YaHei" w:eastAsia="Microsoft YaHei" w:hAnsi="Microsoft YaHei"/>
-                <w:b w:val="false"/>
-                <w:bCs w:val="false"/>
-                <w:color w:val="17324D"/>
-                <w:sz w:val="19"/>
-                <w:szCs w:val="19"/>
-              </w:rPr>
-              <w:t xml:space="preserve">【请填写】</w:t>
-            </w:r>
-          </w:p>
-        </w:tc>
-        <w:tc>
-          <w:tcPr>
-            <w:shd w:fill="FCFDFC" w:color="auto" w:val="clear"/>
-            <w:tcMar>
-              <w:top w:type="dxa" w:w="100"/>
-              <w:left w:type="dxa" w:w="120"/>
-              <w:bottom w:type="dxa" w:w="100"/>
-              <w:right w:type="dxa" w:w="120"/>
-            </w:tcMar>
-            <w:vAlign w:val="center"/>
-          </w:tcPr>
-          <w:p>
-            <w:r>
-              <w:rPr>
-                <w:rFonts w:ascii="Microsoft YaHei" w:cs="Microsoft YaHei" w:eastAsia="Microsoft YaHei" w:hAnsi="Microsoft YaHei"/>
-                <w:b w:val="false"/>
-                <w:bCs w:val="false"/>
-                <w:color w:val="17324D"/>
-                <w:sz w:val="19"/>
-                <w:szCs w:val="19"/>
-              </w:rPr>
-              <w:t xml:space="preserve">【请填写实际分工】</w:t>
-            </w:r>
-          </w:p>
-        </w:tc>
-        <w:tc>
-          <w:tcPr>
-            <w:shd w:fill="FCFDFC" w:color="auto" w:val="clear"/>
-            <w:tcMar>
-              <w:top w:type="dxa" w:w="100"/>
-              <w:left w:type="dxa" w:w="120"/>
-              <w:bottom w:type="dxa" w:w="100"/>
-              <w:right w:type="dxa" w:w="120"/>
-            </w:tcMar>
-            <w:vAlign w:val="center"/>
-          </w:tcPr>
-          <w:p>
-            <w:r>
-              <w:rPr>
-                <w:rFonts w:ascii="Microsoft YaHei" w:cs="Microsoft YaHei" w:eastAsia="Microsoft YaHei" w:hAnsi="Microsoft YaHei"/>
-                <w:b w:val="false"/>
-                <w:bCs w:val="false"/>
-                <w:color w:val="17324D"/>
-                <w:sz w:val="19"/>
-                <w:szCs w:val="19"/>
-              </w:rPr>
-              <w:t xml:space="preserve">【请填写】</w:t>
+            <w:tcW w:type="dxa" w:w="1800"/>
+            <w:shd w:fill="FCFDFC" w:color="auto" w:val="clear"/>
+            <w:tcMar>
+              <w:top w:type="dxa" w:w="100"/>
+              <w:left w:type="dxa" w:w="120"/>
+              <w:bottom w:type="dxa" w:w="100"/>
+              <w:right w:type="dxa" w:w="120"/>
+            </w:tcMar>
+            <w:vAlign w:val="center"/>
+          </w:tcPr>
+          <w:p>
+            <w:r>
+              <w:rPr>
+                <w:rFonts w:ascii="Microsoft YaHei" w:cs="Microsoft YaHei" w:eastAsia="Microsoft YaHei" w:hAnsi="Microsoft YaHei"/>
+                <w:b w:val="false"/>
+                <w:bCs w:val="false"/>
+                <w:color w:val="17324D"/>
+                <w:sz w:val="19"/>
+                <w:szCs w:val="19"/>
+              </w:rPr>
+              <w:t xml:space="preserve">姜萱萱</w:t>
+            </w:r>
+          </w:p>
+        </w:tc>
+        <w:tc>
+          <w:tcPr>
+            <w:tcW w:type="dxa" w:w="1800"/>
+            <w:shd w:fill="FCFDFC" w:color="auto" w:val="clear"/>
+            <w:tcMar>
+              <w:top w:type="dxa" w:w="100"/>
+              <w:left w:type="dxa" w:w="120"/>
+              <w:bottom w:type="dxa" w:w="100"/>
+              <w:right w:type="dxa" w:w="120"/>
+            </w:tcMar>
+            <w:vAlign w:val="center"/>
+          </w:tcPr>
+          <w:p>
+            <w:r>
+              <w:rPr>
+                <w:rFonts w:ascii="Microsoft YaHei" w:cs="Microsoft YaHei" w:eastAsia="Microsoft YaHei" w:hAnsi="Microsoft YaHei"/>
+                <w:b w:val="false"/>
+                <w:bCs w:val="false"/>
+                <w:color w:val="17324D"/>
+                <w:sz w:val="19"/>
+                <w:szCs w:val="19"/>
+              </w:rPr>
+              <w:t xml:space="preserve">52302042008</w:t>
+            </w:r>
+          </w:p>
+        </w:tc>
+        <w:tc>
+          <w:tcPr>
+            <w:tcW w:type="dxa" w:w="3900"/>
+            <w:shd w:fill="FCFDFC" w:color="auto" w:val="clear"/>
+            <w:tcMar>
+              <w:top w:type="dxa" w:w="100"/>
+              <w:left w:type="dxa" w:w="120"/>
+              <w:bottom w:type="dxa" w:w="100"/>
+              <w:right w:type="dxa" w:w="120"/>
+            </w:tcMar>
+            <w:vAlign w:val="center"/>
+          </w:tcPr>
+          <w:p>
+            <w:r>
+              <w:rPr>
+                <w:rFonts w:ascii="Microsoft YaHei" w:cs="Microsoft YaHei" w:eastAsia="Microsoft YaHei" w:hAnsi="Microsoft YaHei"/>
+                <w:b w:val="false"/>
+                <w:bCs w:val="false"/>
+                <w:color w:val="17324D"/>
+                <w:sz w:val="19"/>
+                <w:szCs w:val="19"/>
+              </w:rPr>
+              <w:t xml:space="preserve">界面设计、响应式布局与交互实现</w:t>
+            </w:r>
+          </w:p>
+        </w:tc>
+        <w:tc>
+          <w:tcPr>
+            <w:tcW w:type="dxa" w:w="1200"/>
+            <w:shd w:fill="FCFDFC" w:color="auto" w:val="clear"/>
+            <w:tcMar>
+              <w:top w:type="dxa" w:w="100"/>
+              <w:left w:type="dxa" w:w="120"/>
+              <w:bottom w:type="dxa" w:w="100"/>
+              <w:right w:type="dxa" w:w="120"/>
+            </w:tcMar>
+            <w:vAlign w:val="center"/>
+          </w:tcPr>
+          <w:p>
+            <w:r>
+              <w:rPr>
+                <w:rFonts w:ascii="Microsoft YaHei" w:cs="Microsoft YaHei" w:eastAsia="Microsoft YaHei" w:hAnsi="Microsoft YaHei"/>
+                <w:b w:val="false"/>
+                <w:bCs w:val="false"/>
+                <w:color w:val="17324D"/>
+                <w:sz w:val="19"/>
+                <w:szCs w:val="19"/>
+              </w:rPr>
+              <w:t xml:space="preserve">20%</w:t>
+            </w:r>
+          </w:p>
+        </w:tc>
+      </w:tr>
+      <w:tr>
+        <w:tc>
+          <w:tcPr>
+            <w:tcW w:type="dxa" w:w="1800"/>
+            <w:shd w:fill="FCFDFC" w:color="auto" w:val="clear"/>
+            <w:tcMar>
+              <w:top w:type="dxa" w:w="100"/>
+              <w:left w:type="dxa" w:w="120"/>
+              <w:bottom w:type="dxa" w:w="100"/>
+              <w:right w:type="dxa" w:w="120"/>
+            </w:tcMar>
+            <w:vAlign w:val="center"/>
+          </w:tcPr>
+          <w:p>
+            <w:r>
+              <w:rPr>
+                <w:rFonts w:ascii="Microsoft YaHei" w:cs="Microsoft YaHei" w:eastAsia="Microsoft YaHei" w:hAnsi="Microsoft YaHei"/>
+                <w:b w:val="false"/>
+                <w:bCs w:val="false"/>
+                <w:color w:val="17324D"/>
+                <w:sz w:val="19"/>
+                <w:szCs w:val="19"/>
+              </w:rPr>
+              <w:t xml:space="preserve">刘晓盼</w:t>
+            </w:r>
+          </w:p>
+        </w:tc>
+        <w:tc>
+          <w:tcPr>
+            <w:tcW w:type="dxa" w:w="1800"/>
+            <w:shd w:fill="FCFDFC" w:color="auto" w:val="clear"/>
+            <w:tcMar>
+              <w:top w:type="dxa" w:w="100"/>
+              <w:left w:type="dxa" w:w="120"/>
+              <w:bottom w:type="dxa" w:w="100"/>
+              <w:right w:type="dxa" w:w="120"/>
+            </w:tcMar>
+            <w:vAlign w:val="center"/>
+          </w:tcPr>
+          <w:p>
+            <w:r>
+              <w:rPr>
+                <w:rFonts w:ascii="Microsoft YaHei" w:cs="Microsoft YaHei" w:eastAsia="Microsoft YaHei" w:hAnsi="Microsoft YaHei"/>
+                <w:b w:val="false"/>
+                <w:bCs w:val="false"/>
+                <w:color w:val="17324D"/>
+                <w:sz w:val="19"/>
+                <w:szCs w:val="19"/>
+              </w:rPr>
+              <w:t xml:space="preserve">52302042019</w:t>
+            </w:r>
+          </w:p>
+        </w:tc>
+        <w:tc>
+          <w:tcPr>
+            <w:tcW w:type="dxa" w:w="3900"/>
+            <w:shd w:fill="FCFDFC" w:color="auto" w:val="clear"/>
+            <w:tcMar>
+              <w:top w:type="dxa" w:w="100"/>
+              <w:left w:type="dxa" w:w="120"/>
+              <w:bottom w:type="dxa" w:w="100"/>
+              <w:right w:type="dxa" w:w="120"/>
+            </w:tcMar>
+            <w:vAlign w:val="center"/>
+          </w:tcPr>
+          <w:p>
+            <w:r>
+              <w:rPr>
+                <w:rFonts w:ascii="Microsoft YaHei" w:cs="Microsoft YaHei" w:eastAsia="Microsoft YaHei" w:hAnsi="Microsoft YaHei"/>
+                <w:b w:val="false"/>
+                <w:bCs w:val="false"/>
+                <w:color w:val="17324D"/>
+                <w:sz w:val="19"/>
+                <w:szCs w:val="19"/>
+              </w:rPr>
+              <w:t xml:space="preserve">领域模型、业务规则与报表计算</w:t>
+            </w:r>
+          </w:p>
+        </w:tc>
+        <w:tc>
+          <w:tcPr>
+            <w:tcW w:type="dxa" w:w="1200"/>
+            <w:shd w:fill="FCFDFC" w:color="auto" w:val="clear"/>
+            <w:tcMar>
+              <w:top w:type="dxa" w:w="100"/>
+              <w:left w:type="dxa" w:w="120"/>
+              <w:bottom w:type="dxa" w:w="100"/>
+              <w:right w:type="dxa" w:w="120"/>
+            </w:tcMar>
+            <w:vAlign w:val="center"/>
+          </w:tcPr>
+          <w:p>
+            <w:r>
+              <w:rPr>
+                <w:rFonts w:ascii="Microsoft YaHei" w:cs="Microsoft YaHei" w:eastAsia="Microsoft YaHei" w:hAnsi="Microsoft YaHei"/>
+                <w:b w:val="false"/>
+                <w:bCs w:val="false"/>
+                <w:color w:val="17324D"/>
+                <w:sz w:val="19"/>
+                <w:szCs w:val="19"/>
+              </w:rPr>
+              <w:t xml:space="preserve">20%</w:t>
+            </w:r>
+          </w:p>
+        </w:tc>
+      </w:tr>
+      <w:tr>
+        <w:tc>
+          <w:tcPr>
+            <w:tcW w:type="dxa" w:w="1800"/>
+            <w:shd w:fill="FCFDFC" w:color="auto" w:val="clear"/>
+            <w:tcMar>
+              <w:top w:type="dxa" w:w="100"/>
+              <w:left w:type="dxa" w:w="120"/>
+              <w:bottom w:type="dxa" w:w="100"/>
+              <w:right w:type="dxa" w:w="120"/>
+            </w:tcMar>
+            <w:vAlign w:val="center"/>
+          </w:tcPr>
+          <w:p>
+            <w:r>
+              <w:rPr>
+                <w:rFonts w:ascii="Microsoft YaHei" w:cs="Microsoft YaHei" w:eastAsia="Microsoft YaHei" w:hAnsi="Microsoft YaHei"/>
+                <w:b w:val="false"/>
+                <w:bCs w:val="false"/>
+                <w:color w:val="17324D"/>
+                <w:sz w:val="19"/>
+                <w:szCs w:val="19"/>
+              </w:rPr>
+              <w:t xml:space="preserve">王晨</w:t>
+            </w:r>
+          </w:p>
+        </w:tc>
+        <w:tc>
+          <w:tcPr>
+            <w:tcW w:type="dxa" w:w="1800"/>
+            <w:shd w:fill="FCFDFC" w:color="auto" w:val="clear"/>
+            <w:tcMar>
+              <w:top w:type="dxa" w:w="100"/>
+              <w:left w:type="dxa" w:w="120"/>
+              <w:bottom w:type="dxa" w:w="100"/>
+              <w:right w:type="dxa" w:w="120"/>
+            </w:tcMar>
+            <w:vAlign w:val="center"/>
+          </w:tcPr>
+          <w:p>
+            <w:r>
+              <w:rPr>
+                <w:rFonts w:ascii="Microsoft YaHei" w:cs="Microsoft YaHei" w:eastAsia="Microsoft YaHei" w:hAnsi="Microsoft YaHei"/>
+                <w:b w:val="false"/>
+                <w:bCs w:val="false"/>
+                <w:color w:val="17324D"/>
+                <w:sz w:val="19"/>
+                <w:szCs w:val="19"/>
+              </w:rPr>
+              <w:t xml:space="preserve">52302042035</w:t>
+            </w:r>
+          </w:p>
+        </w:tc>
+        <w:tc>
+          <w:tcPr>
+            <w:tcW w:type="dxa" w:w="3900"/>
+            <w:shd w:fill="FCFDFC" w:color="auto" w:val="clear"/>
+            <w:tcMar>
+              <w:top w:type="dxa" w:w="100"/>
+              <w:left w:type="dxa" w:w="120"/>
+              <w:bottom w:type="dxa" w:w="100"/>
+              <w:right w:type="dxa" w:w="120"/>
+            </w:tcMar>
+            <w:vAlign w:val="center"/>
+          </w:tcPr>
+          <w:p>
+            <w:r>
+              <w:rPr>
+                <w:rFonts w:ascii="Microsoft YaHei" w:cs="Microsoft YaHei" w:eastAsia="Microsoft YaHei" w:hAnsi="Microsoft YaHei"/>
+                <w:b w:val="false"/>
+                <w:bCs w:val="false"/>
+                <w:color w:val="17324D"/>
+                <w:sz w:val="19"/>
+                <w:szCs w:val="19"/>
+              </w:rPr>
+              <w:t xml:space="preserve">数据导入、安全控制与自动化测试</w:t>
+            </w:r>
+          </w:p>
+        </w:tc>
+        <w:tc>
+          <w:tcPr>
+            <w:tcW w:type="dxa" w:w="1200"/>
+            <w:shd w:fill="FCFDFC" w:color="auto" w:val="clear"/>
+            <w:tcMar>
+              <w:top w:type="dxa" w:w="100"/>
+              <w:left w:type="dxa" w:w="120"/>
+              <w:bottom w:type="dxa" w:w="100"/>
+              <w:right w:type="dxa" w:w="120"/>
+            </w:tcMar>
+            <w:vAlign w:val="center"/>
+          </w:tcPr>
+          <w:p>
+            <w:r>
+              <w:rPr>
+                <w:rFonts w:ascii="Microsoft YaHei" w:cs="Microsoft YaHei" w:eastAsia="Microsoft YaHei" w:hAnsi="Microsoft YaHei"/>
+                <w:b w:val="false"/>
+                <w:bCs w:val="false"/>
+                <w:color w:val="17324D"/>
+                <w:sz w:val="19"/>
+                <w:szCs w:val="19"/>
+              </w:rPr>
+              <w:t xml:space="preserve">20%</w:t>
+            </w:r>
+          </w:p>
+        </w:tc>
+      </w:tr>
+      <w:tr>
+        <w:tc>
+          <w:tcPr>
+            <w:tcW w:type="dxa" w:w="1800"/>
+            <w:shd w:fill="FCFDFC" w:color="auto" w:val="clear"/>
+            <w:tcMar>
+              <w:top w:type="dxa" w:w="100"/>
+              <w:left w:type="dxa" w:w="120"/>
+              <w:bottom w:type="dxa" w:w="100"/>
+              <w:right w:type="dxa" w:w="120"/>
+            </w:tcMar>
+            <w:vAlign w:val="center"/>
+          </w:tcPr>
+          <w:p>
+            <w:r>
+              <w:rPr>
+                <w:rFonts w:ascii="Microsoft YaHei" w:cs="Microsoft YaHei" w:eastAsia="Microsoft YaHei" w:hAnsi="Microsoft YaHei"/>
+                <w:b w:val="false"/>
+                <w:bCs w:val="false"/>
+                <w:color w:val="17324D"/>
+                <w:sz w:val="19"/>
+                <w:szCs w:val="19"/>
+              </w:rPr>
+              <w:t xml:space="preserve">朱婷婷</w:t>
+            </w:r>
+          </w:p>
+        </w:tc>
+        <w:tc>
+          <w:tcPr>
+            <w:tcW w:type="dxa" w:w="1800"/>
+            <w:shd w:fill="FCFDFC" w:color="auto" w:val="clear"/>
+            <w:tcMar>
+              <w:top w:type="dxa" w:w="100"/>
+              <w:left w:type="dxa" w:w="120"/>
+              <w:bottom w:type="dxa" w:w="100"/>
+              <w:right w:type="dxa" w:w="120"/>
+            </w:tcMar>
+            <w:vAlign w:val="center"/>
+          </w:tcPr>
+          <w:p>
+            <w:r>
+              <w:rPr>
+                <w:rFonts w:ascii="Microsoft YaHei" w:cs="Microsoft YaHei" w:eastAsia="Microsoft YaHei" w:hAnsi="Microsoft YaHei"/>
+                <w:b w:val="false"/>
+                <w:bCs w:val="false"/>
+                <w:color w:val="17324D"/>
+                <w:sz w:val="19"/>
+                <w:szCs w:val="19"/>
+              </w:rPr>
+              <w:t xml:space="preserve">52302042055</w:t>
+            </w:r>
+          </w:p>
+        </w:tc>
+        <w:tc>
+          <w:tcPr>
+            <w:tcW w:type="dxa" w:w="3900"/>
+            <w:shd w:fill="FCFDFC" w:color="auto" w:val="clear"/>
+            <w:tcMar>
+              <w:top w:type="dxa" w:w="100"/>
+              <w:left w:type="dxa" w:w="120"/>
+              <w:bottom w:type="dxa" w:w="100"/>
+              <w:right w:type="dxa" w:w="120"/>
+            </w:tcMar>
+            <w:vAlign w:val="center"/>
+          </w:tcPr>
+          <w:p>
+            <w:r>
+              <w:rPr>
+                <w:rFonts w:ascii="Microsoft YaHei" w:cs="Microsoft YaHei" w:eastAsia="Microsoft YaHei" w:hAnsi="Microsoft YaHei"/>
+                <w:b w:val="false"/>
+                <w:bCs w:val="false"/>
+                <w:color w:val="17324D"/>
+                <w:sz w:val="19"/>
+                <w:szCs w:val="19"/>
+              </w:rPr>
+              <w:t xml:space="preserve">部署打包、实训报告与答辩材料</w:t>
+            </w:r>
+          </w:p>
+        </w:tc>
+        <w:tc>
+          <w:tcPr>
+            <w:tcW w:type="dxa" w:w="1200"/>
+            <w:shd w:fill="FCFDFC" w:color="auto" w:val="clear"/>
+            <w:tcMar>
+              <w:top w:type="dxa" w:w="100"/>
+              <w:left w:type="dxa" w:w="120"/>
+              <w:bottom w:type="dxa" w:w="100"/>
+              <w:right w:type="dxa" w:w="120"/>
+            </w:tcMar>
+            <w:vAlign w:val="center"/>
+          </w:tcPr>
+          <w:p>
+            <w:r>
+              <w:rPr>
+                <w:rFonts w:ascii="Microsoft YaHei" w:cs="Microsoft YaHei" w:eastAsia="Microsoft YaHei" w:hAnsi="Microsoft YaHei"/>
+                <w:b w:val="false"/>
+                <w:bCs w:val="false"/>
+                <w:color w:val="17324D"/>
+                <w:sz w:val="19"/>
+                <w:szCs w:val="19"/>
+              </w:rPr>
+              <w:t xml:space="preserve">20%</w:t>
             </w:r>
           </w:p>
         </w:tc>

</xml_diff>